<commit_message>
Add merge sort implementations and docs
Add merge sort implementations and related docs: JavaScript (ARRAY/Sorting_Implementation/merge_sort.js) and Python (ARRAY/Sorting_Implementation/merge_sort.py) implementations (with example usage), new documentation files (ARRAY/merge_sort.docx, ARRAY/Quick_Sort.docx), and an updated ARRAY/NOTES.docx. These additions provide reference implementations and docs for array sorting algorithms.
</commit_message>
<xml_diff>
--- a/ARRAY/NOTES.docx
+++ b/ARRAY/NOTES.docx
@@ -2886,6 +2886,7 @@
           <w:rStyle w:val="HTMLCode"/>
         </w:rPr>
       </w:pPr>
+      <w:proofErr w:type="gramStart"/>
       <w:r>
         <w:rPr>
           <w:rStyle w:val="hljs-builtin"/>
@@ -2898,6 +2899,7 @@
         </w:rPr>
         <w:t>(</w:t>
       </w:r>
+      <w:proofErr w:type="gramEnd"/>
       <w:r>
         <w:rPr>
           <w:rStyle w:val="hljs-string"/>
@@ -2927,6 +2929,1699 @@
         </w:rPr>
         <w:t>, total)</w:t>
       </w:r>
+    </w:p>
+    <w:p>
+      <w:pPr>
+        <w:pStyle w:val="HTMLPreformatted"/>
+        <w:rPr>
+          <w:rStyle w:val="HTMLCode"/>
+        </w:rPr>
+      </w:pPr>
+    </w:p>
+    <w:p>
+      <w:pPr>
+        <w:pStyle w:val="HTMLPreformatted"/>
+        <w:rPr>
+          <w:rStyle w:val="HTMLCode"/>
+        </w:rPr>
+      </w:pPr>
+    </w:p>
+    <w:p>
+      <w:pPr>
+        <w:pStyle w:val="HTMLPreformatted"/>
+        <w:rPr>
+          <w:rStyle w:val="HTMLCode"/>
+        </w:rPr>
+      </w:pPr>
+    </w:p>
+    <w:p>
+      <w:pPr>
+        <w:pStyle w:val="HTMLPreformatted"/>
+        <w:rPr>
+          <w:rStyle w:val="HTMLCode"/>
+        </w:rPr>
+      </w:pPr>
+    </w:p>
+    <w:p>
+      <w:pPr>
+        <w:pStyle w:val="HTMLPreformatted"/>
+        <w:rPr>
+          <w:rStyle w:val="HTMLCode"/>
+        </w:rPr>
+      </w:pPr>
+    </w:p>
+    <w:p>
+      <w:pPr>
+        <w:pStyle w:val="HTMLPreformatted"/>
+        <w:rPr>
+          <w:rStyle w:val="HTMLCode"/>
+        </w:rPr>
+      </w:pPr>
+    </w:p>
+    <w:p>
+      <w:pPr>
+        <w:pStyle w:val="HTMLPreformatted"/>
+        <w:rPr>
+          <w:rStyle w:val="HTMLCode"/>
+        </w:rPr>
+      </w:pPr>
+    </w:p>
+    <w:p>
+      <w:pPr>
+        <w:pStyle w:val="HTMLPreformatted"/>
+        <w:rPr>
+          <w:rStyle w:val="HTMLCode"/>
+        </w:rPr>
+      </w:pPr>
+    </w:p>
+    <w:p>
+      <w:pPr>
+        <w:pStyle w:val="HTMLPreformatted"/>
+        <w:rPr>
+          <w:rStyle w:val="HTMLCode"/>
+        </w:rPr>
+      </w:pPr>
+    </w:p>
+    <w:p>
+      <w:pPr>
+        <w:pStyle w:val="pdq2pgselectionanchorcontainer"/>
+      </w:pPr>
+      <w:proofErr w:type="gramStart"/>
+      <w:r>
+        <w:rPr>
+          <w:rStyle w:val="HTMLCode"/>
+        </w:rPr>
+        <w:t>extend(</w:t>
+      </w:r>
+      <w:proofErr w:type="gramEnd"/>
+      <w:r>
+        <w:rPr>
+          <w:rStyle w:val="HTMLCode"/>
+        </w:rPr>
+        <w:t>)</w:t>
+      </w:r>
+      <w:r>
+        <w:t xml:space="preserve"> is a method used with Python lists. It takes an </w:t>
+      </w:r>
+      <w:proofErr w:type="spellStart"/>
+      <w:r>
+        <w:t>iterable</w:t>
+      </w:r>
+      <w:proofErr w:type="spellEnd"/>
+      <w:r>
+        <w:t>—something you can loop over—and adds each of its elements individually to the end of the list.</w:t>
+      </w:r>
+    </w:p>
+    <w:p>
+      <w:pPr>
+        <w:pStyle w:val="HTMLPreformatted"/>
+        <w:rPr>
+          <w:rStyle w:val="HTMLCode"/>
+        </w:rPr>
+      </w:pPr>
+      <w:proofErr w:type="gramStart"/>
+      <w:r>
+        <w:rPr>
+          <w:rStyle w:val="11"/>
+        </w:rPr>
+        <w:t>fruits</w:t>
+      </w:r>
+      <w:proofErr w:type="gramEnd"/>
+      <w:r>
+        <w:rPr>
+          <w:rStyle w:val="HTMLCode"/>
+        </w:rPr>
+        <w:t xml:space="preserve"> </w:t>
+      </w:r>
+      <w:r>
+        <w:rPr>
+          <w:rStyle w:val="v"/>
+        </w:rPr>
+        <w:t>=</w:t>
+      </w:r>
+      <w:r>
+        <w:rPr>
+          <w:rStyle w:val="HTMLCode"/>
+        </w:rPr>
+        <w:t xml:space="preserve"> [</w:t>
+      </w:r>
+      <w:r>
+        <w:rPr>
+          <w:rStyle w:val="z"/>
+        </w:rPr>
+        <w:t>"apple"</w:t>
+      </w:r>
+      <w:r>
+        <w:rPr>
+          <w:rStyle w:val="HTMLCode"/>
+        </w:rPr>
+        <w:t xml:space="preserve">, </w:t>
+      </w:r>
+      <w:r>
+        <w:rPr>
+          <w:rStyle w:val="z"/>
+        </w:rPr>
+        <w:t>"banana"</w:t>
+      </w:r>
+      <w:r>
+        <w:rPr>
+          <w:rStyle w:val="HTMLCode"/>
+        </w:rPr>
+        <w:t>]</w:t>
+      </w:r>
+    </w:p>
+    <w:p>
+      <w:pPr>
+        <w:pStyle w:val="HTMLPreformatted"/>
+        <w:rPr>
+          <w:rStyle w:val="HTMLCode"/>
+        </w:rPr>
+      </w:pPr>
+      <w:proofErr w:type="spellStart"/>
+      <w:r>
+        <w:rPr>
+          <w:rStyle w:val="11"/>
+        </w:rPr>
+        <w:t>more_fruits</w:t>
+      </w:r>
+      <w:proofErr w:type="spellEnd"/>
+      <w:r>
+        <w:rPr>
+          <w:rStyle w:val="HTMLCode"/>
+        </w:rPr>
+        <w:t xml:space="preserve"> </w:t>
+      </w:r>
+      <w:r>
+        <w:rPr>
+          <w:rStyle w:val="v"/>
+        </w:rPr>
+        <w:t>=</w:t>
+      </w:r>
+      <w:r>
+        <w:rPr>
+          <w:rStyle w:val="HTMLCode"/>
+        </w:rPr>
+        <w:t xml:space="preserve"> [</w:t>
+      </w:r>
+      <w:r>
+        <w:rPr>
+          <w:rStyle w:val="z"/>
+        </w:rPr>
+        <w:t>"orange"</w:t>
+      </w:r>
+      <w:r>
+        <w:rPr>
+          <w:rStyle w:val="HTMLCode"/>
+        </w:rPr>
+        <w:t xml:space="preserve">, </w:t>
+      </w:r>
+      <w:r>
+        <w:rPr>
+          <w:rStyle w:val="z"/>
+        </w:rPr>
+        <w:t>"mango"</w:t>
+      </w:r>
+      <w:r>
+        <w:rPr>
+          <w:rStyle w:val="HTMLCode"/>
+        </w:rPr>
+        <w:t>]</w:t>
+      </w:r>
+    </w:p>
+    <w:p>
+      <w:pPr>
+        <w:pStyle w:val="HTMLPreformatted"/>
+        <w:rPr>
+          <w:rStyle w:val="HTMLCode"/>
+        </w:rPr>
+      </w:pPr>
+    </w:p>
+    <w:p>
+      <w:pPr>
+        <w:pStyle w:val="HTMLPreformatted"/>
+        <w:rPr>
+          <w:rStyle w:val="HTMLCode"/>
+        </w:rPr>
+      </w:pPr>
+      <w:proofErr w:type="spellStart"/>
+      <w:proofErr w:type="gramStart"/>
+      <w:r>
+        <w:rPr>
+          <w:rStyle w:val="11"/>
+        </w:rPr>
+        <w:t>fruits</w:t>
+      </w:r>
+      <w:r>
+        <w:rPr>
+          <w:rStyle w:val="v"/>
+        </w:rPr>
+        <w:t>.</w:t>
+      </w:r>
+      <w:r>
+        <w:rPr>
+          <w:rStyle w:val="HTMLCode"/>
+        </w:rPr>
+        <w:t>extend</w:t>
+      </w:r>
+      <w:proofErr w:type="spellEnd"/>
+      <w:r>
+        <w:rPr>
+          <w:rStyle w:val="HTMLCode"/>
+        </w:rPr>
+        <w:t>(</w:t>
+      </w:r>
+      <w:proofErr w:type="spellStart"/>
+      <w:proofErr w:type="gramEnd"/>
+      <w:r>
+        <w:rPr>
+          <w:rStyle w:val="11"/>
+        </w:rPr>
+        <w:t>more_fruits</w:t>
+      </w:r>
+      <w:proofErr w:type="spellEnd"/>
+      <w:r>
+        <w:rPr>
+          <w:rStyle w:val="HTMLCode"/>
+        </w:rPr>
+        <w:t>)</w:t>
+      </w:r>
+    </w:p>
+    <w:p>
+      <w:pPr>
+        <w:pStyle w:val="HTMLPreformatted"/>
+        <w:rPr>
+          <w:rStyle w:val="HTMLCode"/>
+        </w:rPr>
+      </w:pPr>
+    </w:p>
+    <w:p>
+      <w:pPr>
+        <w:pStyle w:val="HTMLPreformatted"/>
+        <w:rPr>
+          <w:rStyle w:val="HTMLCode"/>
+        </w:rPr>
+      </w:pPr>
+      <w:proofErr w:type="gramStart"/>
+      <w:r>
+        <w:rPr>
+          <w:rStyle w:val="11"/>
+        </w:rPr>
+        <w:t>print</w:t>
+      </w:r>
+      <w:r>
+        <w:rPr>
+          <w:rStyle w:val="HTMLCode"/>
+        </w:rPr>
+        <w:t>(</w:t>
+      </w:r>
+      <w:proofErr w:type="gramEnd"/>
+      <w:r>
+        <w:rPr>
+          <w:rStyle w:val="11"/>
+        </w:rPr>
+        <w:t>fruits</w:t>
+      </w:r>
+      <w:r>
+        <w:rPr>
+          <w:rStyle w:val="HTMLCode"/>
+        </w:rPr>
+        <w:t>)</w:t>
+      </w:r>
+    </w:p>
+    <w:p>
+      <w:pPr>
+        <w:pStyle w:val="HTMLPreformatted"/>
+      </w:pPr>
+      <w:r>
+        <w:rPr>
+          <w:rStyle w:val="t"/>
+        </w:rPr>
+        <w:t># ["apple", "banana", "orange", "mango"]</w:t>
+      </w:r>
+    </w:p>
+    <w:p>
+      <w:pPr>
+        <w:pStyle w:val="NormalWeb"/>
+      </w:pPr>
+      <w:r>
+        <w:t>You can think of this as roughly equivalent to:</w:t>
+      </w:r>
+    </w:p>
+    <w:p>
+      <w:pPr>
+        <w:pStyle w:val="HTMLPreformatted"/>
+        <w:rPr>
+          <w:rStyle w:val="HTMLCode"/>
+        </w:rPr>
+      </w:pPr>
+      <w:proofErr w:type="gramStart"/>
+      <w:r>
+        <w:rPr>
+          <w:rStyle w:val="v"/>
+        </w:rPr>
+        <w:t>for</w:t>
+      </w:r>
+      <w:proofErr w:type="gramEnd"/>
+      <w:r>
+        <w:rPr>
+          <w:rStyle w:val="HTMLCode"/>
+        </w:rPr>
+        <w:t xml:space="preserve"> </w:t>
+      </w:r>
+      <w:r>
+        <w:rPr>
+          <w:rStyle w:val="11"/>
+        </w:rPr>
+        <w:t>fruit</w:t>
+      </w:r>
+      <w:r>
+        <w:rPr>
+          <w:rStyle w:val="HTMLCode"/>
+        </w:rPr>
+        <w:t xml:space="preserve"> </w:t>
+      </w:r>
+      <w:r>
+        <w:rPr>
+          <w:rStyle w:val="v"/>
+        </w:rPr>
+        <w:t>in</w:t>
+      </w:r>
+      <w:r>
+        <w:rPr>
+          <w:rStyle w:val="HTMLCode"/>
+        </w:rPr>
+        <w:t xml:space="preserve"> </w:t>
+      </w:r>
+      <w:proofErr w:type="spellStart"/>
+      <w:r>
+        <w:rPr>
+          <w:rStyle w:val="11"/>
+        </w:rPr>
+        <w:t>more_fruits</w:t>
+      </w:r>
+      <w:proofErr w:type="spellEnd"/>
+      <w:r>
+        <w:rPr>
+          <w:rStyle w:val="HTMLCode"/>
+        </w:rPr>
+        <w:t>:</w:t>
+      </w:r>
+    </w:p>
+    <w:p>
+      <w:pPr>
+        <w:pStyle w:val="HTMLPreformatted"/>
+      </w:pPr>
+      <w:r>
+        <w:rPr>
+          <w:rStyle w:val="HTMLCode"/>
+        </w:rPr>
+        <w:t xml:space="preserve">    </w:t>
+      </w:r>
+      <w:proofErr w:type="spellStart"/>
+      <w:proofErr w:type="gramStart"/>
+      <w:r>
+        <w:rPr>
+          <w:rStyle w:val="11"/>
+        </w:rPr>
+        <w:t>fruits</w:t>
+      </w:r>
+      <w:r>
+        <w:rPr>
+          <w:rStyle w:val="v"/>
+        </w:rPr>
+        <w:t>.</w:t>
+      </w:r>
+      <w:r>
+        <w:rPr>
+          <w:rStyle w:val="HTMLCode"/>
+        </w:rPr>
+        <w:t>append</w:t>
+      </w:r>
+      <w:proofErr w:type="spellEnd"/>
+      <w:r>
+        <w:rPr>
+          <w:rStyle w:val="HTMLCode"/>
+        </w:rPr>
+        <w:t>(</w:t>
+      </w:r>
+      <w:proofErr w:type="gramEnd"/>
+      <w:r>
+        <w:rPr>
+          <w:rStyle w:val="11"/>
+        </w:rPr>
+        <w:t>fruit</w:t>
+      </w:r>
+      <w:r>
+        <w:rPr>
+          <w:rStyle w:val="HTMLCode"/>
+        </w:rPr>
+        <w:t>)</w:t>
+      </w:r>
+    </w:p>
+    <w:p>
+      <w:pPr>
+        <w:pStyle w:val="Heading3"/>
+      </w:pPr>
+      <w:proofErr w:type="gramStart"/>
+      <w:r>
+        <w:rPr>
+          <w:rStyle w:val="HTMLCode"/>
+        </w:rPr>
+        <w:t>extend(</w:t>
+      </w:r>
+      <w:proofErr w:type="gramEnd"/>
+      <w:r>
+        <w:rPr>
+          <w:rStyle w:val="HTMLCode"/>
+        </w:rPr>
+        <w:t>)</w:t>
+      </w:r>
+      <w:r>
+        <w:t xml:space="preserve"> versus </w:t>
+      </w:r>
+      <w:r>
+        <w:rPr>
+          <w:rStyle w:val="HTMLCode"/>
+        </w:rPr>
+        <w:t>append()</w:t>
+      </w:r>
+    </w:p>
+    <w:p>
+      <w:pPr>
+        <w:pStyle w:val="NormalWeb"/>
+      </w:pPr>
+      <w:r>
+        <w:t>The important difference is whether the argument is added as one object or unpacked into separate elements:</w:t>
+      </w:r>
+    </w:p>
+    <w:p>
+      <w:pPr>
+        <w:pStyle w:val="HTMLPreformatted"/>
+        <w:rPr>
+          <w:rStyle w:val="HTMLCode"/>
+        </w:rPr>
+      </w:pPr>
+      <w:proofErr w:type="gramStart"/>
+      <w:r>
+        <w:rPr>
+          <w:rStyle w:val="11"/>
+        </w:rPr>
+        <w:t>items</w:t>
+      </w:r>
+      <w:proofErr w:type="gramEnd"/>
+      <w:r>
+        <w:rPr>
+          <w:rStyle w:val="HTMLCode"/>
+        </w:rPr>
+        <w:t xml:space="preserve"> </w:t>
+      </w:r>
+      <w:r>
+        <w:rPr>
+          <w:rStyle w:val="v"/>
+        </w:rPr>
+        <w:t>=</w:t>
+      </w:r>
+      <w:r>
+        <w:rPr>
+          <w:rStyle w:val="HTMLCode"/>
+        </w:rPr>
+        <w:t xml:space="preserve"> [</w:t>
+      </w:r>
+      <w:r>
+        <w:rPr>
+          <w:rStyle w:val="y"/>
+          <w:rFonts w:eastAsiaTheme="majorEastAsia"/>
+        </w:rPr>
+        <w:t>1</w:t>
+      </w:r>
+      <w:r>
+        <w:rPr>
+          <w:rStyle w:val="HTMLCode"/>
+        </w:rPr>
+        <w:t xml:space="preserve">, </w:t>
+      </w:r>
+      <w:r>
+        <w:rPr>
+          <w:rStyle w:val="y"/>
+          <w:rFonts w:eastAsiaTheme="majorEastAsia"/>
+        </w:rPr>
+        <w:t>2</w:t>
+      </w:r>
+      <w:r>
+        <w:rPr>
+          <w:rStyle w:val="HTMLCode"/>
+        </w:rPr>
+        <w:t>]</w:t>
+      </w:r>
+    </w:p>
+    <w:p>
+      <w:pPr>
+        <w:pStyle w:val="HTMLPreformatted"/>
+        <w:rPr>
+          <w:rStyle w:val="HTMLCode"/>
+        </w:rPr>
+      </w:pPr>
+      <w:proofErr w:type="spellStart"/>
+      <w:proofErr w:type="gramStart"/>
+      <w:r>
+        <w:rPr>
+          <w:rStyle w:val="11"/>
+        </w:rPr>
+        <w:t>items</w:t>
+      </w:r>
+      <w:r>
+        <w:rPr>
+          <w:rStyle w:val="v"/>
+        </w:rPr>
+        <w:t>.</w:t>
+      </w:r>
+      <w:r>
+        <w:rPr>
+          <w:rStyle w:val="HTMLCode"/>
+        </w:rPr>
+        <w:t>append</w:t>
+      </w:r>
+      <w:proofErr w:type="spellEnd"/>
+      <w:r>
+        <w:rPr>
+          <w:rStyle w:val="HTMLCode"/>
+        </w:rPr>
+        <w:t>(</w:t>
+      </w:r>
+      <w:proofErr w:type="gramEnd"/>
+      <w:r>
+        <w:rPr>
+          <w:rStyle w:val="HTMLCode"/>
+        </w:rPr>
+        <w:t>[</w:t>
+      </w:r>
+      <w:r>
+        <w:rPr>
+          <w:rStyle w:val="y"/>
+          <w:rFonts w:eastAsiaTheme="majorEastAsia"/>
+        </w:rPr>
+        <w:t>3</w:t>
+      </w:r>
+      <w:r>
+        <w:rPr>
+          <w:rStyle w:val="HTMLCode"/>
+        </w:rPr>
+        <w:t xml:space="preserve">, </w:t>
+      </w:r>
+      <w:r>
+        <w:rPr>
+          <w:rStyle w:val="y"/>
+          <w:rFonts w:eastAsiaTheme="majorEastAsia"/>
+        </w:rPr>
+        <w:t>4</w:t>
+      </w:r>
+      <w:r>
+        <w:rPr>
+          <w:rStyle w:val="HTMLCode"/>
+        </w:rPr>
+        <w:t>])</w:t>
+      </w:r>
+    </w:p>
+    <w:p>
+      <w:pPr>
+        <w:pStyle w:val="HTMLPreformatted"/>
+        <w:rPr>
+          <w:rStyle w:val="HTMLCode"/>
+        </w:rPr>
+      </w:pPr>
+    </w:p>
+    <w:p>
+      <w:pPr>
+        <w:pStyle w:val="HTMLPreformatted"/>
+        <w:rPr>
+          <w:rStyle w:val="HTMLCode"/>
+        </w:rPr>
+      </w:pPr>
+      <w:proofErr w:type="gramStart"/>
+      <w:r>
+        <w:rPr>
+          <w:rStyle w:val="11"/>
+        </w:rPr>
+        <w:t>print</w:t>
+      </w:r>
+      <w:r>
+        <w:rPr>
+          <w:rStyle w:val="HTMLCode"/>
+        </w:rPr>
+        <w:t>(</w:t>
+      </w:r>
+      <w:proofErr w:type="gramEnd"/>
+      <w:r>
+        <w:rPr>
+          <w:rStyle w:val="11"/>
+        </w:rPr>
+        <w:t>items</w:t>
+      </w:r>
+      <w:r>
+        <w:rPr>
+          <w:rStyle w:val="HTMLCode"/>
+        </w:rPr>
+        <w:t>)</w:t>
+      </w:r>
+    </w:p>
+    <w:p>
+      <w:pPr>
+        <w:pStyle w:val="HTMLPreformatted"/>
+      </w:pPr>
+      <w:r>
+        <w:rPr>
+          <w:rStyle w:val="t"/>
+        </w:rPr>
+        <w:t># [1, 2, [3, 4]]</w:t>
+      </w:r>
+    </w:p>
+    <w:p>
+      <w:pPr>
+        <w:pStyle w:val="NormalWeb"/>
+      </w:pPr>
+      <w:proofErr w:type="gramStart"/>
+      <w:r>
+        <w:rPr>
+          <w:rStyle w:val="HTMLCode"/>
+        </w:rPr>
+        <w:t>append(</w:t>
+      </w:r>
+      <w:proofErr w:type="gramEnd"/>
+      <w:r>
+        <w:rPr>
+          <w:rStyle w:val="HTMLCode"/>
+        </w:rPr>
+        <w:t>)</w:t>
+      </w:r>
+      <w:r>
+        <w:t xml:space="preserve"> adds the entire </w:t>
+      </w:r>
+      <w:r>
+        <w:rPr>
+          <w:rStyle w:val="HTMLCode"/>
+        </w:rPr>
+        <w:t>[3, 4]</w:t>
+      </w:r>
+      <w:r>
+        <w:t xml:space="preserve"> list as one new element.</w:t>
+      </w:r>
+    </w:p>
+    <w:p>
+      <w:pPr>
+        <w:pStyle w:val="HTMLPreformatted"/>
+        <w:rPr>
+          <w:rStyle w:val="HTMLCode"/>
+        </w:rPr>
+      </w:pPr>
+      <w:proofErr w:type="gramStart"/>
+      <w:r>
+        <w:rPr>
+          <w:rStyle w:val="11"/>
+        </w:rPr>
+        <w:t>items</w:t>
+      </w:r>
+      <w:proofErr w:type="gramEnd"/>
+      <w:r>
+        <w:rPr>
+          <w:rStyle w:val="HTMLCode"/>
+        </w:rPr>
+        <w:t xml:space="preserve"> </w:t>
+      </w:r>
+      <w:r>
+        <w:rPr>
+          <w:rStyle w:val="v"/>
+        </w:rPr>
+        <w:t>=</w:t>
+      </w:r>
+      <w:r>
+        <w:rPr>
+          <w:rStyle w:val="HTMLCode"/>
+        </w:rPr>
+        <w:t xml:space="preserve"> [</w:t>
+      </w:r>
+      <w:r>
+        <w:rPr>
+          <w:rStyle w:val="y"/>
+          <w:rFonts w:eastAsiaTheme="majorEastAsia"/>
+        </w:rPr>
+        <w:t>1</w:t>
+      </w:r>
+      <w:r>
+        <w:rPr>
+          <w:rStyle w:val="HTMLCode"/>
+        </w:rPr>
+        <w:t xml:space="preserve">, </w:t>
+      </w:r>
+      <w:r>
+        <w:rPr>
+          <w:rStyle w:val="y"/>
+          <w:rFonts w:eastAsiaTheme="majorEastAsia"/>
+        </w:rPr>
+        <w:t>2</w:t>
+      </w:r>
+      <w:r>
+        <w:rPr>
+          <w:rStyle w:val="HTMLCode"/>
+        </w:rPr>
+        <w:t>]</w:t>
+      </w:r>
+    </w:p>
+    <w:p>
+      <w:pPr>
+        <w:pStyle w:val="HTMLPreformatted"/>
+        <w:rPr>
+          <w:rStyle w:val="HTMLCode"/>
+        </w:rPr>
+      </w:pPr>
+      <w:proofErr w:type="spellStart"/>
+      <w:proofErr w:type="gramStart"/>
+      <w:r>
+        <w:rPr>
+          <w:rStyle w:val="11"/>
+        </w:rPr>
+        <w:t>items</w:t>
+      </w:r>
+      <w:r>
+        <w:rPr>
+          <w:rStyle w:val="v"/>
+        </w:rPr>
+        <w:t>.</w:t>
+      </w:r>
+      <w:r>
+        <w:rPr>
+          <w:rStyle w:val="HTMLCode"/>
+        </w:rPr>
+        <w:t>extend</w:t>
+      </w:r>
+      <w:proofErr w:type="spellEnd"/>
+      <w:r>
+        <w:rPr>
+          <w:rStyle w:val="HTMLCode"/>
+        </w:rPr>
+        <w:t>(</w:t>
+      </w:r>
+      <w:proofErr w:type="gramEnd"/>
+      <w:r>
+        <w:rPr>
+          <w:rStyle w:val="HTMLCode"/>
+        </w:rPr>
+        <w:t>[</w:t>
+      </w:r>
+      <w:r>
+        <w:rPr>
+          <w:rStyle w:val="y"/>
+          <w:rFonts w:eastAsiaTheme="majorEastAsia"/>
+        </w:rPr>
+        <w:t>3</w:t>
+      </w:r>
+      <w:r>
+        <w:rPr>
+          <w:rStyle w:val="HTMLCode"/>
+        </w:rPr>
+        <w:t xml:space="preserve">, </w:t>
+      </w:r>
+      <w:r>
+        <w:rPr>
+          <w:rStyle w:val="y"/>
+          <w:rFonts w:eastAsiaTheme="majorEastAsia"/>
+        </w:rPr>
+        <w:t>4</w:t>
+      </w:r>
+      <w:r>
+        <w:rPr>
+          <w:rStyle w:val="HTMLCode"/>
+        </w:rPr>
+        <w:t>])</w:t>
+      </w:r>
+    </w:p>
+    <w:p>
+      <w:pPr>
+        <w:pStyle w:val="HTMLPreformatted"/>
+        <w:rPr>
+          <w:rStyle w:val="HTMLCode"/>
+        </w:rPr>
+      </w:pPr>
+    </w:p>
+    <w:p>
+      <w:pPr>
+        <w:pStyle w:val="HTMLPreformatted"/>
+        <w:rPr>
+          <w:rStyle w:val="HTMLCode"/>
+        </w:rPr>
+      </w:pPr>
+      <w:proofErr w:type="gramStart"/>
+      <w:r>
+        <w:rPr>
+          <w:rStyle w:val="11"/>
+        </w:rPr>
+        <w:t>print</w:t>
+      </w:r>
+      <w:r>
+        <w:rPr>
+          <w:rStyle w:val="HTMLCode"/>
+        </w:rPr>
+        <w:t>(</w:t>
+      </w:r>
+      <w:proofErr w:type="gramEnd"/>
+      <w:r>
+        <w:rPr>
+          <w:rStyle w:val="11"/>
+        </w:rPr>
+        <w:t>items</w:t>
+      </w:r>
+      <w:r>
+        <w:rPr>
+          <w:rStyle w:val="HTMLCode"/>
+        </w:rPr>
+        <w:t>)</w:t>
+      </w:r>
+    </w:p>
+    <w:p>
+      <w:pPr>
+        <w:pStyle w:val="HTMLPreformatted"/>
+      </w:pPr>
+      <w:r>
+        <w:rPr>
+          <w:rStyle w:val="t"/>
+        </w:rPr>
+        <w:t># [1, 2, 3, 4]</w:t>
+      </w:r>
+    </w:p>
+    <w:p>
+      <w:pPr>
+        <w:pStyle w:val="NormalWeb"/>
+      </w:pPr>
+      <w:proofErr w:type="gramStart"/>
+      <w:r>
+        <w:rPr>
+          <w:rStyle w:val="HTMLCode"/>
+        </w:rPr>
+        <w:t>extend(</w:t>
+      </w:r>
+      <w:proofErr w:type="gramEnd"/>
+      <w:r>
+        <w:rPr>
+          <w:rStyle w:val="HTMLCode"/>
+        </w:rPr>
+        <w:t>)</w:t>
+      </w:r>
+      <w:r>
+        <w:t xml:space="preserve"> takes the elements </w:t>
+      </w:r>
+      <w:r>
+        <w:rPr>
+          <w:rStyle w:val="HTMLCode"/>
+        </w:rPr>
+        <w:t>3</w:t>
+      </w:r>
+      <w:r>
+        <w:t xml:space="preserve"> and </w:t>
+      </w:r>
+      <w:r>
+        <w:rPr>
+          <w:rStyle w:val="HTMLCode"/>
+        </w:rPr>
+        <w:t>4</w:t>
+      </w:r>
+      <w:r>
+        <w:t xml:space="preserve"> and adds them separately.</w:t>
+      </w:r>
+    </w:p>
+    <w:p>
+      <w:pPr>
+        <w:pStyle w:val="NormalWeb"/>
+      </w:pPr>
+      <w:r>
+        <w:t xml:space="preserve">It works with different </w:t>
+      </w:r>
+      <w:proofErr w:type="spellStart"/>
+      <w:r>
+        <w:t>iterable</w:t>
+      </w:r>
+      <w:proofErr w:type="spellEnd"/>
+      <w:r>
+        <w:t xml:space="preserve"> types:</w:t>
+      </w:r>
+    </w:p>
+    <w:p>
+      <w:pPr>
+        <w:pStyle w:val="HTMLPreformatted"/>
+        <w:rPr>
+          <w:rStyle w:val="HTMLCode"/>
+        </w:rPr>
+      </w:pPr>
+      <w:proofErr w:type="gramStart"/>
+      <w:r>
+        <w:rPr>
+          <w:rStyle w:val="11"/>
+        </w:rPr>
+        <w:t>numbers</w:t>
+      </w:r>
+      <w:proofErr w:type="gramEnd"/>
+      <w:r>
+        <w:rPr>
+          <w:rStyle w:val="HTMLCode"/>
+        </w:rPr>
+        <w:t xml:space="preserve"> </w:t>
+      </w:r>
+      <w:r>
+        <w:rPr>
+          <w:rStyle w:val="v"/>
+        </w:rPr>
+        <w:t>=</w:t>
+      </w:r>
+      <w:r>
+        <w:rPr>
+          <w:rStyle w:val="HTMLCode"/>
+        </w:rPr>
+        <w:t xml:space="preserve"> [</w:t>
+      </w:r>
+      <w:r>
+        <w:rPr>
+          <w:rStyle w:val="y"/>
+          <w:rFonts w:eastAsiaTheme="majorEastAsia"/>
+        </w:rPr>
+        <w:t>1</w:t>
+      </w:r>
+      <w:r>
+        <w:rPr>
+          <w:rStyle w:val="HTMLCode"/>
+        </w:rPr>
+        <w:t xml:space="preserve">, </w:t>
+      </w:r>
+      <w:r>
+        <w:rPr>
+          <w:rStyle w:val="y"/>
+          <w:rFonts w:eastAsiaTheme="majorEastAsia"/>
+        </w:rPr>
+        <w:t>2</w:t>
+      </w:r>
+      <w:r>
+        <w:rPr>
+          <w:rStyle w:val="HTMLCode"/>
+        </w:rPr>
+        <w:t>]</w:t>
+      </w:r>
+    </w:p>
+    <w:p>
+      <w:pPr>
+        <w:pStyle w:val="HTMLPreformatted"/>
+        <w:rPr>
+          <w:rStyle w:val="HTMLCode"/>
+        </w:rPr>
+      </w:pPr>
+    </w:p>
+    <w:p>
+      <w:pPr>
+        <w:pStyle w:val="HTMLPreformatted"/>
+        <w:rPr>
+          <w:rStyle w:val="HTMLCode"/>
+        </w:rPr>
+      </w:pPr>
+      <w:proofErr w:type="spellStart"/>
+      <w:proofErr w:type="gramStart"/>
+      <w:r>
+        <w:rPr>
+          <w:rStyle w:val="11"/>
+        </w:rPr>
+        <w:t>numbers</w:t>
+      </w:r>
+      <w:r>
+        <w:rPr>
+          <w:rStyle w:val="v"/>
+        </w:rPr>
+        <w:t>.</w:t>
+      </w:r>
+      <w:r>
+        <w:rPr>
+          <w:rStyle w:val="HTMLCode"/>
+        </w:rPr>
+        <w:t>extend</w:t>
+      </w:r>
+      <w:proofErr w:type="spellEnd"/>
+      <w:r>
+        <w:rPr>
+          <w:rStyle w:val="HTMLCode"/>
+        </w:rPr>
+        <w:t>(</w:t>
+      </w:r>
+      <w:proofErr w:type="gramEnd"/>
+      <w:r>
+        <w:rPr>
+          <w:rStyle w:val="HTMLCode"/>
+        </w:rPr>
+        <w:t>(</w:t>
+      </w:r>
+      <w:r>
+        <w:rPr>
+          <w:rStyle w:val="y"/>
+          <w:rFonts w:eastAsiaTheme="majorEastAsia"/>
+        </w:rPr>
+        <w:t>3</w:t>
+      </w:r>
+      <w:r>
+        <w:rPr>
+          <w:rStyle w:val="HTMLCode"/>
+        </w:rPr>
+        <w:t xml:space="preserve">, </w:t>
+      </w:r>
+      <w:r>
+        <w:rPr>
+          <w:rStyle w:val="y"/>
+          <w:rFonts w:eastAsiaTheme="majorEastAsia"/>
+        </w:rPr>
+        <w:t>4</w:t>
+      </w:r>
+      <w:r>
+        <w:rPr>
+          <w:rStyle w:val="HTMLCode"/>
+        </w:rPr>
+        <w:t xml:space="preserve">))  </w:t>
+      </w:r>
+      <w:r>
+        <w:rPr>
+          <w:rStyle w:val="t"/>
+        </w:rPr>
+        <w:t># Tuple</w:t>
+      </w:r>
+    </w:p>
+    <w:p>
+      <w:pPr>
+        <w:pStyle w:val="HTMLPreformatted"/>
+        <w:rPr>
+          <w:rStyle w:val="HTMLCode"/>
+        </w:rPr>
+      </w:pPr>
+      <w:proofErr w:type="spellStart"/>
+      <w:proofErr w:type="gramStart"/>
+      <w:r>
+        <w:rPr>
+          <w:rStyle w:val="11"/>
+        </w:rPr>
+        <w:t>numbers</w:t>
+      </w:r>
+      <w:r>
+        <w:rPr>
+          <w:rStyle w:val="v"/>
+        </w:rPr>
+        <w:t>.</w:t>
+      </w:r>
+      <w:r>
+        <w:rPr>
+          <w:rStyle w:val="HTMLCode"/>
+        </w:rPr>
+        <w:t>extend</w:t>
+      </w:r>
+      <w:proofErr w:type="spellEnd"/>
+      <w:r>
+        <w:rPr>
+          <w:rStyle w:val="HTMLCode"/>
+        </w:rPr>
+        <w:t>(</w:t>
+      </w:r>
+      <w:proofErr w:type="gramEnd"/>
+      <w:r>
+        <w:rPr>
+          <w:rStyle w:val="HTMLCode"/>
+        </w:rPr>
+        <w:t>{</w:t>
+      </w:r>
+      <w:r>
+        <w:rPr>
+          <w:rStyle w:val="y"/>
+          <w:rFonts w:eastAsiaTheme="majorEastAsia"/>
+        </w:rPr>
+        <w:t>5</w:t>
+      </w:r>
+      <w:r>
+        <w:rPr>
+          <w:rStyle w:val="HTMLCode"/>
+        </w:rPr>
+        <w:t xml:space="preserve">, </w:t>
+      </w:r>
+      <w:r>
+        <w:rPr>
+          <w:rStyle w:val="y"/>
+          <w:rFonts w:eastAsiaTheme="majorEastAsia"/>
+        </w:rPr>
+        <w:t>6</w:t>
+      </w:r>
+      <w:r>
+        <w:rPr>
+          <w:rStyle w:val="HTMLCode"/>
+        </w:rPr>
+        <w:t xml:space="preserve">})  </w:t>
+      </w:r>
+      <w:r>
+        <w:rPr>
+          <w:rStyle w:val="t"/>
+        </w:rPr>
+        <w:t># Set</w:t>
+      </w:r>
+    </w:p>
+    <w:p>
+      <w:pPr>
+        <w:pStyle w:val="HTMLPreformatted"/>
+        <w:rPr>
+          <w:rStyle w:val="HTMLCode"/>
+        </w:rPr>
+      </w:pPr>
+    </w:p>
+    <w:p>
+      <w:pPr>
+        <w:pStyle w:val="HTMLPreformatted"/>
+        <w:rPr>
+          <w:rStyle w:val="HTMLCode"/>
+        </w:rPr>
+      </w:pPr>
+      <w:proofErr w:type="gramStart"/>
+      <w:r>
+        <w:rPr>
+          <w:rStyle w:val="11"/>
+        </w:rPr>
+        <w:t>print</w:t>
+      </w:r>
+      <w:r>
+        <w:rPr>
+          <w:rStyle w:val="HTMLCode"/>
+        </w:rPr>
+        <w:t>(</w:t>
+      </w:r>
+      <w:proofErr w:type="gramEnd"/>
+      <w:r>
+        <w:rPr>
+          <w:rStyle w:val="11"/>
+        </w:rPr>
+        <w:t>numbers</w:t>
+      </w:r>
+      <w:r>
+        <w:rPr>
+          <w:rStyle w:val="HTMLCode"/>
+        </w:rPr>
+        <w:t>)</w:t>
+      </w:r>
+    </w:p>
+    <w:p>
+      <w:pPr>
+        <w:pStyle w:val="HTMLPreformatted"/>
+      </w:pPr>
+      <w:r>
+        <w:rPr>
+          <w:rStyle w:val="t"/>
+        </w:rPr>
+        <w:t># [1, 2, 3, 4, 5, 6]</w:t>
+      </w:r>
+    </w:p>
+    <w:p>
+      <w:pPr>
+        <w:pStyle w:val="NormalWeb"/>
+      </w:pPr>
+      <w:r>
+        <w:t xml:space="preserve">Be careful with strings because each character </w:t>
+      </w:r>
+      <w:proofErr w:type="gramStart"/>
+      <w:r>
+        <w:t>is added</w:t>
+      </w:r>
+      <w:proofErr w:type="gramEnd"/>
+      <w:r>
+        <w:t xml:space="preserve"> separately:</w:t>
+      </w:r>
+    </w:p>
+    <w:p>
+      <w:pPr>
+        <w:pStyle w:val="HTMLPreformatted"/>
+        <w:rPr>
+          <w:rStyle w:val="HTMLCode"/>
+        </w:rPr>
+      </w:pPr>
+      <w:proofErr w:type="gramStart"/>
+      <w:r>
+        <w:rPr>
+          <w:rStyle w:val="11"/>
+        </w:rPr>
+        <w:lastRenderedPageBreak/>
+        <w:t>letters</w:t>
+      </w:r>
+      <w:proofErr w:type="gramEnd"/>
+      <w:r>
+        <w:rPr>
+          <w:rStyle w:val="HTMLCode"/>
+        </w:rPr>
+        <w:t xml:space="preserve"> </w:t>
+      </w:r>
+      <w:r>
+        <w:rPr>
+          <w:rStyle w:val="v"/>
+        </w:rPr>
+        <w:t>=</w:t>
+      </w:r>
+      <w:r>
+        <w:rPr>
+          <w:rStyle w:val="HTMLCode"/>
+        </w:rPr>
+        <w:t xml:space="preserve"> [</w:t>
+      </w:r>
+      <w:r>
+        <w:rPr>
+          <w:rStyle w:val="z"/>
+        </w:rPr>
+        <w:t>"a"</w:t>
+      </w:r>
+      <w:r>
+        <w:rPr>
+          <w:rStyle w:val="HTMLCode"/>
+        </w:rPr>
+        <w:t>]</w:t>
+      </w:r>
+    </w:p>
+    <w:p>
+      <w:pPr>
+        <w:pStyle w:val="HTMLPreformatted"/>
+        <w:rPr>
+          <w:rStyle w:val="HTMLCode"/>
+        </w:rPr>
+      </w:pPr>
+      <w:proofErr w:type="spellStart"/>
+      <w:proofErr w:type="gramStart"/>
+      <w:r>
+        <w:rPr>
+          <w:rStyle w:val="11"/>
+        </w:rPr>
+        <w:t>letters</w:t>
+      </w:r>
+      <w:r>
+        <w:rPr>
+          <w:rStyle w:val="v"/>
+        </w:rPr>
+        <w:t>.</w:t>
+      </w:r>
+      <w:r>
+        <w:rPr>
+          <w:rStyle w:val="HTMLCode"/>
+        </w:rPr>
+        <w:t>extend</w:t>
+      </w:r>
+      <w:proofErr w:type="spellEnd"/>
+      <w:r>
+        <w:rPr>
+          <w:rStyle w:val="HTMLCode"/>
+        </w:rPr>
+        <w:t>(</w:t>
+      </w:r>
+      <w:proofErr w:type="gramEnd"/>
+      <w:r>
+        <w:rPr>
+          <w:rStyle w:val="z"/>
+        </w:rPr>
+        <w:t>"hello"</w:t>
+      </w:r>
+      <w:r>
+        <w:rPr>
+          <w:rStyle w:val="HTMLCode"/>
+        </w:rPr>
+        <w:t>)</w:t>
+      </w:r>
+    </w:p>
+    <w:p>
+      <w:pPr>
+        <w:pStyle w:val="HTMLPreformatted"/>
+        <w:rPr>
+          <w:rStyle w:val="HTMLCode"/>
+        </w:rPr>
+      </w:pPr>
+    </w:p>
+    <w:p>
+      <w:pPr>
+        <w:pStyle w:val="HTMLPreformatted"/>
+        <w:rPr>
+          <w:rStyle w:val="HTMLCode"/>
+        </w:rPr>
+      </w:pPr>
+      <w:proofErr w:type="gramStart"/>
+      <w:r>
+        <w:rPr>
+          <w:rStyle w:val="11"/>
+        </w:rPr>
+        <w:t>print</w:t>
+      </w:r>
+      <w:r>
+        <w:rPr>
+          <w:rStyle w:val="HTMLCode"/>
+        </w:rPr>
+        <w:t>(</w:t>
+      </w:r>
+      <w:proofErr w:type="gramEnd"/>
+      <w:r>
+        <w:rPr>
+          <w:rStyle w:val="11"/>
+        </w:rPr>
+        <w:t>letters</w:t>
+      </w:r>
+      <w:r>
+        <w:rPr>
+          <w:rStyle w:val="HTMLCode"/>
+        </w:rPr>
+        <w:t>)</w:t>
+      </w:r>
+    </w:p>
+    <w:p>
+      <w:pPr>
+        <w:pStyle w:val="HTMLPreformatted"/>
+      </w:pPr>
+      <w:r>
+        <w:rPr>
+          <w:rStyle w:val="t"/>
+        </w:rPr>
+        <w:t># ["a", "h", "e", "l", "l", "o"]</w:t>
+      </w:r>
+    </w:p>
+    <w:p>
+      <w:pPr>
+        <w:pStyle w:val="NormalWeb"/>
+      </w:pPr>
+      <w:r>
+        <w:t xml:space="preserve">Finally, </w:t>
+      </w:r>
+      <w:proofErr w:type="gramStart"/>
+      <w:r>
+        <w:rPr>
+          <w:rStyle w:val="HTMLCode"/>
+        </w:rPr>
+        <w:t>extend(</w:t>
+      </w:r>
+      <w:proofErr w:type="gramEnd"/>
+      <w:r>
+        <w:rPr>
+          <w:rStyle w:val="HTMLCode"/>
+        </w:rPr>
+        <w:t>)</w:t>
+      </w:r>
+      <w:r>
+        <w:t xml:space="preserve"> changes the original list directly and returns </w:t>
+      </w:r>
+      <w:r>
+        <w:rPr>
+          <w:rStyle w:val="HTMLCode"/>
+        </w:rPr>
+        <w:t>None</w:t>
+      </w:r>
+      <w:r>
+        <w:t>:</w:t>
+      </w:r>
+    </w:p>
+    <w:p>
+      <w:pPr>
+        <w:pStyle w:val="HTMLPreformatted"/>
+        <w:rPr>
+          <w:rStyle w:val="HTMLCode"/>
+        </w:rPr>
+      </w:pPr>
+      <w:proofErr w:type="gramStart"/>
+      <w:r>
+        <w:rPr>
+          <w:rStyle w:val="11"/>
+        </w:rPr>
+        <w:t>numbers</w:t>
+      </w:r>
+      <w:proofErr w:type="gramEnd"/>
+      <w:r>
+        <w:rPr>
+          <w:rStyle w:val="HTMLCode"/>
+        </w:rPr>
+        <w:t xml:space="preserve"> </w:t>
+      </w:r>
+      <w:r>
+        <w:rPr>
+          <w:rStyle w:val="v"/>
+        </w:rPr>
+        <w:t>=</w:t>
+      </w:r>
+      <w:r>
+        <w:rPr>
+          <w:rStyle w:val="HTMLCode"/>
+        </w:rPr>
+        <w:t xml:space="preserve"> [</w:t>
+      </w:r>
+      <w:r>
+        <w:rPr>
+          <w:rStyle w:val="y"/>
+          <w:rFonts w:eastAsiaTheme="majorEastAsia"/>
+        </w:rPr>
+        <w:t>1</w:t>
+      </w:r>
+      <w:r>
+        <w:rPr>
+          <w:rStyle w:val="HTMLCode"/>
+        </w:rPr>
+        <w:t xml:space="preserve">, </w:t>
+      </w:r>
+      <w:r>
+        <w:rPr>
+          <w:rStyle w:val="y"/>
+          <w:rFonts w:eastAsiaTheme="majorEastAsia"/>
+        </w:rPr>
+        <w:t>2</w:t>
+      </w:r>
+      <w:r>
+        <w:rPr>
+          <w:rStyle w:val="HTMLCode"/>
+        </w:rPr>
+        <w:t>]</w:t>
+      </w:r>
+    </w:p>
+    <w:p>
+      <w:pPr>
+        <w:pStyle w:val="HTMLPreformatted"/>
+        <w:rPr>
+          <w:rStyle w:val="HTMLCode"/>
+        </w:rPr>
+      </w:pPr>
+      <w:proofErr w:type="gramStart"/>
+      <w:r>
+        <w:rPr>
+          <w:rStyle w:val="11"/>
+        </w:rPr>
+        <w:t>result</w:t>
+      </w:r>
+      <w:proofErr w:type="gramEnd"/>
+      <w:r>
+        <w:rPr>
+          <w:rStyle w:val="HTMLCode"/>
+        </w:rPr>
+        <w:t xml:space="preserve"> </w:t>
+      </w:r>
+      <w:r>
+        <w:rPr>
+          <w:rStyle w:val="v"/>
+        </w:rPr>
+        <w:t>=</w:t>
+      </w:r>
+      <w:r>
+        <w:rPr>
+          <w:rStyle w:val="HTMLCode"/>
+        </w:rPr>
+        <w:t xml:space="preserve"> </w:t>
+      </w:r>
+      <w:proofErr w:type="spellStart"/>
+      <w:r>
+        <w:rPr>
+          <w:rStyle w:val="11"/>
+        </w:rPr>
+        <w:t>numbers</w:t>
+      </w:r>
+      <w:r>
+        <w:rPr>
+          <w:rStyle w:val="v"/>
+        </w:rPr>
+        <w:t>.</w:t>
+      </w:r>
+      <w:r>
+        <w:rPr>
+          <w:rStyle w:val="HTMLCode"/>
+        </w:rPr>
+        <w:t>extend</w:t>
+      </w:r>
+      <w:proofErr w:type="spellEnd"/>
+      <w:r>
+        <w:rPr>
+          <w:rStyle w:val="HTMLCode"/>
+        </w:rPr>
+        <w:t>([</w:t>
+      </w:r>
+      <w:r>
+        <w:rPr>
+          <w:rStyle w:val="y"/>
+          <w:rFonts w:eastAsiaTheme="majorEastAsia"/>
+        </w:rPr>
+        <w:t>3</w:t>
+      </w:r>
+      <w:r>
+        <w:rPr>
+          <w:rStyle w:val="HTMLCode"/>
+        </w:rPr>
+        <w:t xml:space="preserve">, </w:t>
+      </w:r>
+      <w:r>
+        <w:rPr>
+          <w:rStyle w:val="y"/>
+          <w:rFonts w:eastAsiaTheme="majorEastAsia"/>
+        </w:rPr>
+        <w:t>4</w:t>
+      </w:r>
+      <w:r>
+        <w:rPr>
+          <w:rStyle w:val="HTMLCode"/>
+        </w:rPr>
+        <w:t>])</w:t>
+      </w:r>
+    </w:p>
+    <w:p>
+      <w:pPr>
+        <w:pStyle w:val="HTMLPreformatted"/>
+        <w:rPr>
+          <w:rStyle w:val="HTMLCode"/>
+        </w:rPr>
+      </w:pPr>
+    </w:p>
+    <w:p>
+      <w:pPr>
+        <w:pStyle w:val="HTMLPreformatted"/>
+        <w:rPr>
+          <w:rStyle w:val="HTMLCode"/>
+        </w:rPr>
+      </w:pPr>
+      <w:proofErr w:type="gramStart"/>
+      <w:r>
+        <w:rPr>
+          <w:rStyle w:val="11"/>
+        </w:rPr>
+        <w:t>print</w:t>
+      </w:r>
+      <w:r>
+        <w:rPr>
+          <w:rStyle w:val="HTMLCode"/>
+        </w:rPr>
+        <w:t>(</w:t>
+      </w:r>
+      <w:proofErr w:type="gramEnd"/>
+      <w:r>
+        <w:rPr>
+          <w:rStyle w:val="11"/>
+        </w:rPr>
+        <w:t>numbers</w:t>
+      </w:r>
+      <w:r>
+        <w:rPr>
+          <w:rStyle w:val="HTMLCode"/>
+        </w:rPr>
+        <w:t xml:space="preserve">)  </w:t>
+      </w:r>
+      <w:r>
+        <w:rPr>
+          <w:rStyle w:val="t"/>
+        </w:rPr>
+        <w:t># [1, 2, 3, 4]</w:t>
+      </w:r>
+    </w:p>
+    <w:p>
+      <w:pPr>
+        <w:pStyle w:val="HTMLPreformatted"/>
+      </w:pPr>
+      <w:proofErr w:type="gramStart"/>
+      <w:r>
+        <w:rPr>
+          <w:rStyle w:val="11"/>
+        </w:rPr>
+        <w:t>print</w:t>
+      </w:r>
+      <w:r>
+        <w:rPr>
+          <w:rStyle w:val="HTMLCode"/>
+        </w:rPr>
+        <w:t>(</w:t>
+      </w:r>
+      <w:proofErr w:type="gramEnd"/>
+      <w:r>
+        <w:rPr>
+          <w:rStyle w:val="11"/>
+        </w:rPr>
+        <w:t>result</w:t>
+      </w:r>
+      <w:r>
+        <w:rPr>
+          <w:rStyle w:val="HTMLCode"/>
+        </w:rPr>
+        <w:t xml:space="preserve">)   </w:t>
+      </w:r>
+      <w:r>
+        <w:rPr>
+          <w:rStyle w:val="t"/>
+        </w:rPr>
+        <w:t># None</w:t>
+      </w:r>
+    </w:p>
+    <w:p>
+      <w:pPr>
+        <w:pStyle w:val="NormalWeb"/>
+      </w:pPr>
+      <w:r>
+        <w:t xml:space="preserve">A helpful rule: use </w:t>
+      </w:r>
+      <w:proofErr w:type="gramStart"/>
+      <w:r>
+        <w:rPr>
+          <w:rStyle w:val="HTMLCode"/>
+        </w:rPr>
+        <w:t>append(</w:t>
+      </w:r>
+      <w:proofErr w:type="gramEnd"/>
+      <w:r>
+        <w:rPr>
+          <w:rStyle w:val="HTMLCode"/>
+        </w:rPr>
+        <w:t>)</w:t>
+      </w:r>
+      <w:r>
+        <w:t xml:space="preserve"> to add </w:t>
+      </w:r>
+      <w:r>
+        <w:rPr>
+          <w:rStyle w:val="Strong"/>
+        </w:rPr>
+        <w:t>one thing</w:t>
+      </w:r>
+      <w:r>
+        <w:t xml:space="preserve">, and </w:t>
+      </w:r>
+      <w:r>
+        <w:rPr>
+          <w:rStyle w:val="HTMLCode"/>
+        </w:rPr>
+        <w:t>extend()</w:t>
+      </w:r>
+      <w:r>
+        <w:t xml:space="preserve"> to add </w:t>
+      </w:r>
+      <w:r>
+        <w:rPr>
+          <w:rStyle w:val="Strong"/>
+        </w:rPr>
+        <w:t>all the items inside something</w:t>
+      </w:r>
+      <w:r>
+        <w:t>.</w:t>
+      </w:r>
+    </w:p>
+    <w:p>
+      <w:pPr>
+        <w:pStyle w:val="HTMLPreformatted"/>
+        <w:rPr>
+          <w:rStyle w:val="HTMLCode"/>
+        </w:rPr>
+      </w:pPr>
+      <w:bookmarkStart w:id="0" w:name="_GoBack"/>
+      <w:bookmarkEnd w:id="0"/>
     </w:p>
     <w:p>
       <w:r>
@@ -4037,6 +5732,7 @@
         <w:rPr>
           <w:rFonts w:ascii="Segoe UI Symbol" w:hAnsi="Segoe UI Symbol" w:cs="Segoe UI Symbol"/>
         </w:rPr>
+        <w:lastRenderedPageBreak/>
         <w:t>🔹</w:t>
       </w:r>
       <w:r>
@@ -4216,7 +5912,6 @@
           <w:sz w:val="27"/>
           <w:szCs w:val="27"/>
         </w:rPr>
-        <w:lastRenderedPageBreak/>
         <w:t>Find the n number</w:t>
       </w:r>
     </w:p>
@@ -4472,6 +6167,7 @@
     </w:p>
     <w:p>
       <w:r>
+        <w:lastRenderedPageBreak/>
         <w:t>}</w:t>
       </w:r>
     </w:p>
@@ -4505,7 +6201,6 @@
           <w:sz w:val="24"/>
           <w:szCs w:val="24"/>
         </w:rPr>
-        <w:lastRenderedPageBreak/>
         <w:t>Alright</w:t>
       </w:r>
       <w:proofErr w:type="gramEnd"/>
@@ -4815,6 +6510,7 @@
           <w:sz w:val="24"/>
           <w:szCs w:val="24"/>
         </w:rPr>
+        <w:lastRenderedPageBreak/>
         <w:pict>
           <v:rect id="_x0000_i1032" style="width:0;height:1.5pt" o:hralign="center" o:hrstd="t" o:hr="t" fillcolor="#a0a0a0" stroked="f"/>
         </w:pict>
@@ -5438,8 +7134,6 @@
           <v:rect id="_x0000_i1035" style="width:0;height:1.5pt" o:hralign="center" o:hrstd="t" o:hr="t" fillcolor="#a0a0a0" stroked="f"/>
         </w:pict>
       </w:r>
-      <w:bookmarkStart w:id="0" w:name="_GoBack"/>
-      <w:bookmarkEnd w:id="0"/>
     </w:p>
     <w:p>
       <w:pPr>
@@ -5478,6 +7172,7 @@
         </w:numPr>
       </w:pPr>
       <w:r>
+        <w:lastRenderedPageBreak/>
         <w:t xml:space="preserve">One starts at </w:t>
       </w:r>
       <w:r>
@@ -6044,7 +7739,6 @@
         <w:rPr>
           <w:rStyle w:val="HTMLCode"/>
         </w:rPr>
-        <w:lastRenderedPageBreak/>
         <w:t xml:space="preserve">    </w:t>
       </w:r>
       <w:proofErr w:type="spellStart"/>
@@ -6806,6 +8500,7 @@
         <w:rPr>
           <w:rStyle w:val="HTMLCode"/>
         </w:rPr>
+        <w:lastRenderedPageBreak/>
         <w:t xml:space="preserve">        </w:t>
       </w:r>
       <w:r>
@@ -7687,7 +9382,6 @@
         <w:rPr>
           <w:rStyle w:val="HTMLCode"/>
         </w:rPr>
-        <w:lastRenderedPageBreak/>
         <w:t xml:space="preserve">    }</w:t>
       </w:r>
     </w:p>
@@ -8138,6 +9832,7 @@
         <w:rPr>
           <w:rFonts w:ascii="Segoe UI Symbol" w:hAnsi="Segoe UI Symbol" w:cs="Segoe UI Symbol"/>
         </w:rPr>
+        <w:lastRenderedPageBreak/>
         <w:t>✅</w:t>
       </w:r>
       <w:r>
@@ -8372,7 +10067,6 @@
         <w:rPr>
           <w:rFonts w:ascii="Segoe UI Symbol" w:hAnsi="Segoe UI Symbol" w:cs="Segoe UI Symbol"/>
         </w:rPr>
-        <w:lastRenderedPageBreak/>
         <w:t>🔹</w:t>
       </w:r>
       <w:r>
@@ -8816,6 +10510,7 @@
         <w:rPr>
           <w:rStyle w:val="hljs-comment"/>
         </w:rPr>
+        <w:lastRenderedPageBreak/>
         <w:t># Example</w:t>
       </w:r>
     </w:p>
@@ -9741,7 +11436,6 @@
         <w:rPr>
           <w:rStyle w:val="HTMLCode"/>
         </w:rPr>
-        <w:lastRenderedPageBreak/>
         <w:t xml:space="preserve">        </w:t>
       </w:r>
       <w:proofErr w:type="spellStart"/>
@@ -10411,6 +12105,7 @@
         <w:rPr>
           <w:rStyle w:val="Emphasis"/>
         </w:rPr>
+        <w:lastRenderedPageBreak/>
         <w:t>(If implementing a custom heap in JS is needed, we can code it too — but this trick is often acceptable in interviews.)</w:t>
       </w:r>
     </w:p>
@@ -10736,8 +12431,214 @@
     </w:p>
     <w:p>
       <w:r>
+        <w:t xml:space="preserve">    </w:t>
+      </w:r>
+      <w:proofErr w:type="spellStart"/>
+      <w:r>
+        <w:t>PriorityQueue</w:t>
+      </w:r>
+      <w:proofErr w:type="spellEnd"/>
+      <w:r>
+        <w:t xml:space="preserve">&lt;Integer&gt; </w:t>
+      </w:r>
+      <w:proofErr w:type="spellStart"/>
+      <w:r>
+        <w:t>minHeap</w:t>
+      </w:r>
+      <w:proofErr w:type="spellEnd"/>
+      <w:r>
+        <w:t xml:space="preserve"> = new </w:t>
+      </w:r>
+      <w:proofErr w:type="spellStart"/>
+      <w:r>
+        <w:t>PriorityQueue</w:t>
+      </w:r>
+      <w:proofErr w:type="spellEnd"/>
+      <w:r>
+        <w:t>&lt;&gt;();</w:t>
+      </w:r>
+    </w:p>
+    <w:p>
+      <w:r>
+        <w:t xml:space="preserve">    </w:t>
+      </w:r>
+    </w:p>
+    <w:p>
+      <w:r>
+        <w:t xml:space="preserve">    // Add elements of both arrays</w:t>
+      </w:r>
+    </w:p>
+    <w:p>
+      <w:r>
+        <w:t xml:space="preserve">    for(</w:t>
+      </w:r>
+      <w:proofErr w:type="spellStart"/>
+      <w:r>
+        <w:t>int</w:t>
+      </w:r>
+      <w:proofErr w:type="spellEnd"/>
+      <w:r>
+        <w:t xml:space="preserve"> </w:t>
+      </w:r>
+      <w:proofErr w:type="spellStart"/>
+      <w:r>
+        <w:t>num</w:t>
+      </w:r>
+      <w:proofErr w:type="spellEnd"/>
+      <w:r>
+        <w:t xml:space="preserve"> : arr1) </w:t>
+      </w:r>
+      <w:proofErr w:type="spellStart"/>
+      <w:r>
+        <w:t>minHeap.add</w:t>
+      </w:r>
+      <w:proofErr w:type="spellEnd"/>
+      <w:r>
+        <w:t>(</w:t>
+      </w:r>
+      <w:proofErr w:type="spellStart"/>
+      <w:r>
+        <w:t>num</w:t>
+      </w:r>
+      <w:proofErr w:type="spellEnd"/>
+      <w:r>
+        <w:t>);</w:t>
+      </w:r>
+    </w:p>
+    <w:p>
+      <w:r>
+        <w:t xml:space="preserve">    for(</w:t>
+      </w:r>
+      <w:proofErr w:type="spellStart"/>
+      <w:r>
+        <w:t>int</w:t>
+      </w:r>
+      <w:proofErr w:type="spellEnd"/>
+      <w:r>
+        <w:t xml:space="preserve"> </w:t>
+      </w:r>
+      <w:proofErr w:type="spellStart"/>
+      <w:r>
+        <w:t>num</w:t>
+      </w:r>
+      <w:proofErr w:type="spellEnd"/>
+      <w:r>
+        <w:t xml:space="preserve"> : arr2) </w:t>
+      </w:r>
+      <w:proofErr w:type="spellStart"/>
+      <w:r>
+        <w:t>minHeap.add</w:t>
+      </w:r>
+      <w:proofErr w:type="spellEnd"/>
+      <w:r>
+        <w:t>(</w:t>
+      </w:r>
+      <w:proofErr w:type="spellStart"/>
+      <w:r>
+        <w:t>num</w:t>
+      </w:r>
+      <w:proofErr w:type="spellEnd"/>
+      <w:r>
+        <w:t>);</w:t>
+      </w:r>
+    </w:p>
+    <w:p>
+      <w:r>
+        <w:t xml:space="preserve">    </w:t>
+      </w:r>
+    </w:p>
+    <w:p>
+      <w:r>
+        <w:t xml:space="preserve">    // Extract elements in sorted order</w:t>
+      </w:r>
+    </w:p>
+    <w:p>
+      <w:r>
+        <w:t xml:space="preserve">    List&lt;Integer&gt; result = new </w:t>
+      </w:r>
+      <w:proofErr w:type="spellStart"/>
+      <w:r>
+        <w:t>ArrayList</w:t>
+      </w:r>
+      <w:proofErr w:type="spellEnd"/>
+      <w:r>
+        <w:t>&lt;&gt;();</w:t>
+      </w:r>
+    </w:p>
+    <w:p>
+      <w:r>
+        <w:t xml:space="preserve">    while(!</w:t>
+      </w:r>
+      <w:proofErr w:type="spellStart"/>
+      <w:r>
+        <w:t>minHeap.isEmpty</w:t>
+      </w:r>
+      <w:proofErr w:type="spellEnd"/>
+      <w:r>
+        <w:t>()) {</w:t>
+      </w:r>
+    </w:p>
+    <w:p>
+      <w:r>
+        <w:t xml:space="preserve">        </w:t>
+      </w:r>
+      <w:proofErr w:type="spellStart"/>
+      <w:r>
+        <w:t>result.add</w:t>
+      </w:r>
+      <w:proofErr w:type="spellEnd"/>
+      <w:r>
+        <w:t>(</w:t>
+      </w:r>
+      <w:proofErr w:type="spellStart"/>
+      <w:r>
+        <w:t>minHeap.poll</w:t>
+      </w:r>
+      <w:proofErr w:type="spellEnd"/>
+      <w:r>
+        <w:t>());</w:t>
+      </w:r>
+    </w:p>
+    <w:p>
+      <w:r>
+        <w:t xml:space="preserve">    }</w:t>
+      </w:r>
+    </w:p>
+    <w:p>
+      <w:r>
+        <w:t xml:space="preserve">    return result;</w:t>
+      </w:r>
+    </w:p>
+    <w:p>
+      <w:r>
+        <w:t>}</w:t>
+      </w:r>
+    </w:p>
+    <w:p>
+      <w:r>
+        <w:rPr>
+          <w:rFonts w:ascii="Segoe UI Symbol" w:hAnsi="Segoe UI Symbol" w:cs="Segoe UI Symbol"/>
+        </w:rPr>
+        <w:t>🔎</w:t>
+      </w:r>
+      <w:r>
+        <w:t xml:space="preserve"> How it works:</w:t>
+      </w:r>
+    </w:p>
+    <w:p>
+      <w:proofErr w:type="spellStart"/>
+      <w:r>
+        <w:t>PriorityQueue</w:t>
+      </w:r>
+      <w:proofErr w:type="spellEnd"/>
+      <w:r>
+        <w:t xml:space="preserve"> as a Min-Heap</w:t>
+      </w:r>
+    </w:p>
+    <w:p>
+      <w:r>
         <w:lastRenderedPageBreak/>
-        <w:t xml:space="preserve">    </w:t>
+        <w:t xml:space="preserve">In Java, </w:t>
       </w:r>
       <w:proofErr w:type="spellStart"/>
       <w:r>
@@ -10745,179 +12646,141 @@
       </w:r>
       <w:proofErr w:type="spellEnd"/>
       <w:r>
-        <w:t xml:space="preserve">&lt;Integer&gt; </w:t>
-      </w:r>
-      <w:proofErr w:type="spellStart"/>
-      <w:r>
-        <w:t>minHeap</w:t>
-      </w:r>
-      <w:proofErr w:type="spellEnd"/>
-      <w:r>
-        <w:t xml:space="preserve"> = new </w:t>
-      </w:r>
-      <w:proofErr w:type="spellStart"/>
-      <w:r>
-        <w:t>PriorityQueue</w:t>
-      </w:r>
-      <w:proofErr w:type="spellEnd"/>
-      <w:r>
-        <w:t>&lt;&gt;();</w:t>
-      </w:r>
-    </w:p>
-    <w:p>
-      <w:r>
-        <w:t xml:space="preserve">    </w:t>
-      </w:r>
-    </w:p>
-    <w:p>
-      <w:r>
-        <w:t xml:space="preserve">    // Add elements of both arrays</w:t>
-      </w:r>
-    </w:p>
-    <w:p>
-      <w:r>
-        <w:t xml:space="preserve">    for(</w:t>
-      </w:r>
+        <w:t xml:space="preserve"> by default is a min-heap.</w:t>
+      </w:r>
+    </w:p>
+    <w:p>
+      <w:r>
+        <w:t>That means the smallest element is always at the head of the queue.</w:t>
+      </w:r>
+    </w:p>
+    <w:p>
+      <w:r>
+        <w:t>Adding all elements</w:t>
+      </w:r>
+    </w:p>
+    <w:p>
+      <w:r>
+        <w:t>You put all numbers from both arrays into the min-heap.</w:t>
+      </w:r>
+    </w:p>
+    <w:p>
+      <w:r>
+        <w:t>At this point, the heap internally arranges them so the smallest is always on top.</w:t>
+      </w:r>
+    </w:p>
+    <w:p>
+      <w:r>
+        <w:t>Heap operations (add) take O(log n) time each.</w:t>
+      </w:r>
+    </w:p>
+    <w:p>
+      <w:r>
+        <w:t>Polling elements (sorted order)</w:t>
+      </w:r>
+    </w:p>
+    <w:p>
+      <w:r>
+        <w:t>poll() removes and returns the smallest element from the heap.</w:t>
+      </w:r>
+    </w:p>
+    <w:p>
+      <w:r>
+        <w:t>Since the heap always keeps the smallest at the front, every poll() gives the next smallest number.</w:t>
+      </w:r>
+    </w:p>
+    <w:p>
+      <w:r>
+        <w:t>This means when you keep polling until empty, you naturally get a sorted sequence.</w:t>
+      </w:r>
+    </w:p>
+    <w:p>
+      <w:r>
+        <w:t>Building the result Each polled element is appended to the result list. Final result is sorted, no matter if arr1 or arr2 were sorted beforehand.</w:t>
+      </w:r>
+    </w:p>
+    <w:p/>
+    <w:p>
+      <w:r>
+        <w:rPr>
+          <w:rFonts w:ascii="Segoe UI Symbol" w:hAnsi="Segoe UI Symbol" w:cs="Segoe UI Symbol"/>
+        </w:rPr>
+        <w:t>✅</w:t>
+      </w:r>
+      <w:r>
+        <w:t xml:space="preserve"> Example:</w:t>
+      </w:r>
+    </w:p>
+    <w:p>
       <w:proofErr w:type="spellStart"/>
       <w:r>
         <w:t>int</w:t>
       </w:r>
       <w:proofErr w:type="spellEnd"/>
       <w:r>
-        <w:t xml:space="preserve"> </w:t>
-      </w:r>
-      <w:proofErr w:type="spellStart"/>
-      <w:r>
-        <w:t>num</w:t>
-      </w:r>
-      <w:proofErr w:type="spellEnd"/>
-      <w:r>
-        <w:t xml:space="preserve"> : arr1) </w:t>
-      </w:r>
-      <w:proofErr w:type="spellStart"/>
-      <w:r>
-        <w:t>minHeap.add</w:t>
-      </w:r>
-      <w:proofErr w:type="spellEnd"/>
-      <w:r>
-        <w:t>(</w:t>
-      </w:r>
-      <w:proofErr w:type="spellStart"/>
-      <w:r>
-        <w:t>num</w:t>
-      </w:r>
-      <w:proofErr w:type="spellEnd"/>
-      <w:r>
-        <w:t>);</w:t>
-      </w:r>
-    </w:p>
-    <w:p>
-      <w:r>
-        <w:t xml:space="preserve">    for(</w:t>
-      </w:r>
+        <w:t>[] arr1 = {5, 1, 3};</w:t>
+      </w:r>
+    </w:p>
+    <w:p>
       <w:proofErr w:type="spellStart"/>
       <w:r>
         <w:t>int</w:t>
       </w:r>
       <w:proofErr w:type="spellEnd"/>
       <w:r>
-        <w:t xml:space="preserve"> </w:t>
-      </w:r>
-      <w:proofErr w:type="spellStart"/>
-      <w:r>
-        <w:t>num</w:t>
-      </w:r>
-      <w:proofErr w:type="spellEnd"/>
-      <w:r>
-        <w:t xml:space="preserve"> : arr2) </w:t>
-      </w:r>
-      <w:proofErr w:type="spellStart"/>
-      <w:r>
-        <w:t>minHeap.add</w:t>
-      </w:r>
-      <w:proofErr w:type="spellEnd"/>
-      <w:r>
-        <w:t>(</w:t>
-      </w:r>
-      <w:proofErr w:type="spellStart"/>
-      <w:r>
-        <w:t>num</w:t>
-      </w:r>
-      <w:proofErr w:type="spellEnd"/>
-      <w:r>
-        <w:t>);</w:t>
-      </w:r>
-    </w:p>
-    <w:p>
-      <w:r>
-        <w:t xml:space="preserve">    </w:t>
-      </w:r>
-    </w:p>
-    <w:p>
-      <w:r>
-        <w:t xml:space="preserve">    // Extract elements in sorted order</w:t>
-      </w:r>
-    </w:p>
-    <w:p>
-      <w:r>
-        <w:t xml:space="preserve">    List&lt;Integer&gt; result = new </w:t>
-      </w:r>
-      <w:proofErr w:type="spellStart"/>
-      <w:r>
-        <w:t>ArrayList</w:t>
-      </w:r>
-      <w:proofErr w:type="spellEnd"/>
-      <w:r>
-        <w:t>&lt;&gt;();</w:t>
-      </w:r>
-    </w:p>
-    <w:p>
-      <w:r>
-        <w:t xml:space="preserve">    while(!</w:t>
-      </w:r>
-      <w:proofErr w:type="spellStart"/>
-      <w:r>
-        <w:t>minHeap.isEmpty</w:t>
-      </w:r>
-      <w:proofErr w:type="spellEnd"/>
-      <w:r>
-        <w:t>()) {</w:t>
-      </w:r>
-    </w:p>
-    <w:p>
-      <w:r>
-        <w:t xml:space="preserve">        </w:t>
-      </w:r>
-      <w:proofErr w:type="spellStart"/>
-      <w:r>
-        <w:t>result.add</w:t>
-      </w:r>
-      <w:proofErr w:type="spellEnd"/>
-      <w:r>
-        <w:t>(</w:t>
-      </w:r>
-      <w:proofErr w:type="spellStart"/>
-      <w:r>
-        <w:t>minHeap.poll</w:t>
-      </w:r>
-      <w:proofErr w:type="spellEnd"/>
-      <w:r>
-        <w:t>());</w:t>
-      </w:r>
-    </w:p>
-    <w:p>
-      <w:r>
-        <w:t xml:space="preserve">    }</w:t>
-      </w:r>
-    </w:p>
-    <w:p>
-      <w:r>
-        <w:t xml:space="preserve">    return result;</w:t>
-      </w:r>
-    </w:p>
-    <w:p>
-      <w:r>
-        <w:t>}</w:t>
+        <w:t>[] arr2 = {6, 2, 4};</w:t>
+      </w:r>
+    </w:p>
+    <w:p>
+      <w:r>
+        <w:t>List&lt;Integer&gt; merged = merge(arr1, arr2);</w:t>
+      </w:r>
+    </w:p>
+    <w:p>
+      <w:proofErr w:type="spellStart"/>
+      <w:r>
+        <w:t>System.out.println</w:t>
+      </w:r>
+      <w:proofErr w:type="spellEnd"/>
+      <w:r>
+        <w:t>(merged);</w:t>
+      </w:r>
+    </w:p>
+    <w:p>
+      <w:r>
+        <w:t>Heap process:</w:t>
+      </w:r>
+    </w:p>
+    <w:p>
+      <w:r>
+        <w:t>Add all → Heap contains {1, 2, 3, 4, 5, 6} internally arranged.</w:t>
+      </w:r>
+    </w:p>
+    <w:p>
+      <w:r>
+        <w:t>Poll → returns 1, 2, 3, 4, 5, 6.</w:t>
+      </w:r>
+    </w:p>
+    <w:p>
+      <w:r>
+        <w:t>Output:</w:t>
+      </w:r>
+    </w:p>
+    <w:p>
+      <w:proofErr w:type="spellStart"/>
+      <w:r>
+        <w:t>csharp</w:t>
+      </w:r>
+      <w:proofErr w:type="spellEnd"/>
+    </w:p>
+    <w:p>
+      <w:r>
+        <w:t>Copy code</w:t>
+      </w:r>
+    </w:p>
+    <w:p>
+      <w:r>
+        <w:t>[1, 2, 3, 4, 5, 6]</w:t>
       </w:r>
     </w:p>
     <w:p>
@@ -10925,198 +12788,30 @@
         <w:rPr>
           <w:rFonts w:ascii="Segoe UI Symbol" w:hAnsi="Segoe UI Symbol" w:cs="Segoe UI Symbol"/>
         </w:rPr>
-        <w:t>🔎</w:t>
-      </w:r>
-      <w:r>
-        <w:t xml:space="preserve"> How it works:</w:t>
-      </w:r>
-    </w:p>
-    <w:p>
-      <w:proofErr w:type="spellStart"/>
-      <w:r>
-        <w:t>PriorityQueue</w:t>
-      </w:r>
-      <w:proofErr w:type="spellEnd"/>
-      <w:r>
-        <w:t xml:space="preserve"> as a Min-Heap</w:t>
-      </w:r>
-    </w:p>
-    <w:p>
-      <w:r>
-        <w:t xml:space="preserve">In Java, </w:t>
-      </w:r>
-      <w:proofErr w:type="spellStart"/>
-      <w:r>
-        <w:t>PriorityQueue</w:t>
-      </w:r>
-      <w:proofErr w:type="spellEnd"/>
-      <w:r>
-        <w:t xml:space="preserve"> by default is a min-heap.</w:t>
-      </w:r>
-    </w:p>
-    <w:p>
-      <w:r>
-        <w:t>That means the smallest element is always at the head of the queue.</w:t>
-      </w:r>
-    </w:p>
-    <w:p>
-      <w:r>
-        <w:t>Adding all elements</w:t>
-      </w:r>
-    </w:p>
-    <w:p>
-      <w:r>
-        <w:t>You put all numbers from both arrays into the min-heap.</w:t>
-      </w:r>
-    </w:p>
-    <w:p>
-      <w:r>
-        <w:t>At this point, the heap internally arranges them so the smallest is always on top.</w:t>
-      </w:r>
-    </w:p>
-    <w:p>
-      <w:r>
-        <w:t>Heap operations (add) take O(log n) time each.</w:t>
-      </w:r>
-    </w:p>
-    <w:p>
-      <w:r>
-        <w:t>Polling elements (sorted order)</w:t>
-      </w:r>
-    </w:p>
-    <w:p>
-      <w:r>
-        <w:t>poll() removes and returns the smallest element from the heap.</w:t>
-      </w:r>
-    </w:p>
-    <w:p>
-      <w:r>
-        <w:t>Since the heap always keeps the smallest at the front, every poll() gives the next smallest number.</w:t>
-      </w:r>
-    </w:p>
-    <w:p>
-      <w:r>
-        <w:t>This means when you keep polling until empty, you naturally get a sorted sequence.</w:t>
-      </w:r>
-    </w:p>
-    <w:p>
-      <w:r>
-        <w:t>Building the result Each polled element is appended to the result list. Final result is sorted, no matter if arr1 or arr2 were sorted beforehand.</w:t>
-      </w:r>
-    </w:p>
-    <w:p/>
-    <w:p>
-      <w:r>
-        <w:rPr>
-          <w:rFonts w:ascii="Segoe UI Symbol" w:hAnsi="Segoe UI Symbol" w:cs="Segoe UI Symbol"/>
-        </w:rPr>
-        <w:t>✅</w:t>
-      </w:r>
-      <w:r>
-        <w:t xml:space="preserve"> Example:</w:t>
-      </w:r>
-    </w:p>
-    <w:p>
-      <w:proofErr w:type="spellStart"/>
+        <w:t>⚖</w:t>
+      </w:r>
+      <w:r>
+        <w:t>️ Comparison with two-pointer merge:</w:t>
+      </w:r>
+    </w:p>
+    <w:p>
+      <w:r>
+        <w:t>Two-pointer merge (your first code):</w:t>
+      </w:r>
+    </w:p>
+    <w:p>
+      <w:r>
+        <w:t>Needs both arrays sorted first.</w:t>
+      </w:r>
+    </w:p>
+    <w:p>
+      <w:r>
+        <w:t>Runs in O(n + m) time (very efficient).</w:t>
+      </w:r>
+    </w:p>
+    <w:p>
       <w:r>
         <w:lastRenderedPageBreak/>
-        <w:t>int</w:t>
-      </w:r>
-      <w:proofErr w:type="spellEnd"/>
-      <w:r>
-        <w:t>[] arr1 = {5, 1, 3};</w:t>
-      </w:r>
-    </w:p>
-    <w:p>
-      <w:proofErr w:type="spellStart"/>
-      <w:r>
-        <w:t>int</w:t>
-      </w:r>
-      <w:proofErr w:type="spellEnd"/>
-      <w:r>
-        <w:t>[] arr2 = {6, 2, 4};</w:t>
-      </w:r>
-    </w:p>
-    <w:p>
-      <w:r>
-        <w:t>List&lt;Integer&gt; merged = merge(arr1, arr2);</w:t>
-      </w:r>
-    </w:p>
-    <w:p>
-      <w:proofErr w:type="spellStart"/>
-      <w:r>
-        <w:t>System.out.println</w:t>
-      </w:r>
-      <w:proofErr w:type="spellEnd"/>
-      <w:r>
-        <w:t>(merged);</w:t>
-      </w:r>
-    </w:p>
-    <w:p>
-      <w:r>
-        <w:t>Heap process:</w:t>
-      </w:r>
-    </w:p>
-    <w:p>
-      <w:r>
-        <w:t>Add all → Heap contains {1, 2, 3, 4, 5, 6} internally arranged.</w:t>
-      </w:r>
-    </w:p>
-    <w:p>
-      <w:r>
-        <w:t>Poll → returns 1, 2, 3, 4, 5, 6.</w:t>
-      </w:r>
-    </w:p>
-    <w:p>
-      <w:r>
-        <w:t>Output:</w:t>
-      </w:r>
-    </w:p>
-    <w:p>
-      <w:proofErr w:type="spellStart"/>
-      <w:r>
-        <w:t>csharp</w:t>
-      </w:r>
-      <w:proofErr w:type="spellEnd"/>
-    </w:p>
-    <w:p>
-      <w:r>
-        <w:t>Copy code</w:t>
-      </w:r>
-    </w:p>
-    <w:p>
-      <w:r>
-        <w:t>[1, 2, 3, 4, 5, 6]</w:t>
-      </w:r>
-    </w:p>
-    <w:p>
-      <w:r>
-        <w:rPr>
-          <w:rFonts w:ascii="Segoe UI Symbol" w:hAnsi="Segoe UI Symbol" w:cs="Segoe UI Symbol"/>
-        </w:rPr>
-        <w:t>⚖</w:t>
-      </w:r>
-      <w:r>
-        <w:t>️ Comparison with two-pointer merge:</w:t>
-      </w:r>
-    </w:p>
-    <w:p>
-      <w:r>
-        <w:t>Two-pointer merge (your first code):</w:t>
-      </w:r>
-    </w:p>
-    <w:p>
-      <w:r>
-        <w:t>Needs both arrays sorted first.</w:t>
-      </w:r>
-    </w:p>
-    <w:p>
-      <w:r>
-        <w:t>Runs in O(n + m) time (very efficient).</w:t>
-      </w:r>
-    </w:p>
-    <w:p>
-      <w:r>
         <w:t>Priority queue merge (this code):</w:t>
       </w:r>
     </w:p>
@@ -11161,7 +12856,6 @@
         <w:rPr>
           <w:rFonts w:ascii="Calibri Light" w:hAnsi="Calibri Light" w:cs="Calibri Light"/>
         </w:rPr>
-        <w:lastRenderedPageBreak/>
         <w:t>🧩</w:t>
       </w:r>
       <w:r>
@@ -11492,6 +13186,7 @@
         <w:pStyle w:val="NormalWeb"/>
       </w:pPr>
       <w:r>
+        <w:lastRenderedPageBreak/>
         <w:t>Rotate 2 times to the right → output should be:</w:t>
       </w:r>
     </w:p>
@@ -11618,7 +13313,6 @@
         <w:pStyle w:val="NormalWeb"/>
       </w:pPr>
       <w:r>
-        <w:lastRenderedPageBreak/>
         <w:t>For example:</w:t>
       </w:r>
       <w:r>
@@ -12029,6 +13723,7 @@
         <w:rPr>
           <w:rStyle w:val="HTMLCode"/>
         </w:rPr>
+        <w:lastRenderedPageBreak/>
         <w:t xml:space="preserve">        K = (K % N) + N</w:t>
       </w:r>
     </w:p>
@@ -12775,7 +14470,6 @@
     </w:p>
     <w:p>
       <w:r>
-        <w:lastRenderedPageBreak/>
         <w:pict>
           <v:rect id="_x0000_i1051" style="width:0;height:1.5pt" o:hralign="center" o:hrstd="t" o:hr="t" fillcolor="#a0a0a0" stroked="f"/>
         </w:pict>
@@ -13080,6 +14774,7 @@
       </w:pPr>
       <w:proofErr w:type="spellStart"/>
       <w:r>
+        <w:lastRenderedPageBreak/>
         <w:t>ChatGPT</w:t>
       </w:r>
       <w:proofErr w:type="spellEnd"/>
@@ -13319,7 +15014,6 @@
         <w:rPr>
           <w:rFonts w:ascii="Segoe UI Symbol" w:hAnsi="Segoe UI Symbol" w:cs="Segoe UI Symbol"/>
         </w:rPr>
-        <w:lastRenderedPageBreak/>
         <w:t>🐍</w:t>
       </w:r>
       <w:r>
@@ -14256,6 +15950,7 @@
         <w:rPr>
           <w:rStyle w:val="HTMLCode"/>
         </w:rPr>
+        <w:lastRenderedPageBreak/>
         <w:t xml:space="preserve">        K = K % N;</w:t>
       </w:r>
     </w:p>
@@ -15313,7 +17008,6 @@
         <w:rPr>
           <w:rStyle w:val="HTMLCode"/>
         </w:rPr>
-        <w:lastRenderedPageBreak/>
         <w:t>}</w:t>
       </w:r>
     </w:p>
@@ -15699,6 +17393,7 @@
     </w:p>
     <w:p>
       <w:r>
+        <w:lastRenderedPageBreak/>
         <w:pict>
           <v:rect id="_x0000_i1058" style="width:0;height:1.5pt" o:hralign="center" o:hrstd="t" o:hr="t" fillcolor="#a0a0a0" stroked="f"/>
         </w:pict>
@@ -16203,7 +17898,6 @@
         <w:rPr>
           <w:rStyle w:val="hljs-builtin"/>
         </w:rPr>
-        <w:lastRenderedPageBreak/>
         <w:t>reverse</w:t>
       </w:r>
       <w:r>
@@ -16492,6 +18186,7 @@
         <w:rPr>
           <w:rFonts w:ascii="Segoe UI Symbol" w:hAnsi="Segoe UI Symbol" w:cs="Segoe UI Symbol"/>
         </w:rPr>
+        <w:lastRenderedPageBreak/>
         <w:t>🔹</w:t>
       </w:r>
       <w:r>
@@ -16995,7 +18690,6 @@
         <w:rPr>
           <w:rFonts w:ascii="Segoe UI Symbol" w:hAnsi="Segoe UI Symbol" w:cs="Segoe UI Symbol"/>
         </w:rPr>
-        <w:lastRenderedPageBreak/>
         <w:t>🔹</w:t>
       </w:r>
       <w:r>
@@ -17237,6 +18931,7 @@
         <w:rPr>
           <w:rStyle w:val="Strong"/>
         </w:rPr>
+        <w:lastRenderedPageBreak/>
         <w:t>Total time:</w:t>
       </w:r>
       <w:r>
@@ -21442,6 +23137,44 @@
     <w:basedOn w:val="DefaultParagraphFont"/>
     <w:rsid w:val="0043729E"/>
   </w:style>
+  <w:style w:type="paragraph" w:customStyle="1" w:styleId="pdq2pgselectionanchorcontainer">
+    <w:name w:val="pdq2pg_selectionanchorcontainer"/>
+    <w:basedOn w:val="Normal"/>
+    <w:rsid w:val="006D031D"/>
+    <w:pPr>
+      <w:spacing w:before="100" w:beforeAutospacing="1" w:after="100" w:afterAutospacing="1" w:line="240" w:lineRule="auto"/>
+    </w:pPr>
+    <w:rPr>
+      <w:rFonts w:ascii="Times New Roman" w:eastAsia="Times New Roman" w:hAnsi="Times New Roman" w:cs="Times New Roman"/>
+      <w:sz w:val="24"/>
+      <w:szCs w:val="24"/>
+    </w:rPr>
+  </w:style>
+  <w:style w:type="character" w:customStyle="1" w:styleId="11">
+    <w:name w:val="ͼ11"/>
+    <w:basedOn w:val="DefaultParagraphFont"/>
+    <w:rsid w:val="006D031D"/>
+  </w:style>
+  <w:style w:type="character" w:customStyle="1" w:styleId="v">
+    <w:name w:val="ͼv"/>
+    <w:basedOn w:val="DefaultParagraphFont"/>
+    <w:rsid w:val="006D031D"/>
+  </w:style>
+  <w:style w:type="character" w:customStyle="1" w:styleId="z">
+    <w:name w:val="ͼz"/>
+    <w:basedOn w:val="DefaultParagraphFont"/>
+    <w:rsid w:val="006D031D"/>
+  </w:style>
+  <w:style w:type="character" w:customStyle="1" w:styleId="t">
+    <w:name w:val="ͼt"/>
+    <w:basedOn w:val="DefaultParagraphFont"/>
+    <w:rsid w:val="006D031D"/>
+  </w:style>
+  <w:style w:type="character" w:customStyle="1" w:styleId="y">
+    <w:name w:val="ͼy"/>
+    <w:basedOn w:val="DefaultParagraphFont"/>
+    <w:rsid w:val="006D031D"/>
+  </w:style>
 </w:styles>
 </file>
 

</xml_diff>